<commit_message>
Paper: add NUST SEECS affiliations and final PDF
Co-Authored-By: Claude Opus 5.5 <noreply@anthropic.com>
</commit_message>
<xml_diff>
--- a/paper/ICEET2026_Right_but_Unsure.docx
+++ b/paper/ICEET2026_Right_but_Unsure.docx
@@ -62,9 +62,8 @@
           <w:iCs/>
           <w:sz w:val="18"/>
           <w:szCs w:val="18"/>
-          <w:highlight w:val="yellow"/>
-        </w:rPr>
-        <w:t xml:space="preserve">[Department]</w:t>
+        </w:rPr>
+        <w:t xml:space="preserve">School of Electrical Engineering and Computer Science (SEECS)</w:t>
       </w:r>
       <w:r>
         <w:br/>
@@ -75,9 +74,8 @@
           <w:iCs/>
           <w:sz w:val="18"/>
           <w:szCs w:val="18"/>
-          <w:highlight w:val="yellow"/>
-        </w:rPr>
-        <w:t xml:space="preserve">[University / Organization]</w:t>
+        </w:rPr>
+        <w:t xml:space="preserve">National University of Sciences and Technology (NUST)</w:t>
       </w:r>
       <w:r>
         <w:br/>
@@ -86,20 +84,8 @@
         <w:rPr>
           <w:sz w:val="18"/>
           <w:szCs w:val="18"/>
-          <w:highlight w:val="yellow"/>
-        </w:rPr>
-        <w:t xml:space="preserve">[City, Country]</w:t>
-      </w:r>
-      <w:r>
-        <w:br/>
-      </w:r>
-      <w:r>
-        <w:rPr>
-          <w:sz w:val="18"/>
-          <w:szCs w:val="18"/>
-          <w:highlight w:val="yellow"/>
-        </w:rPr>
-        <w:t xml:space="preserve">[email address]</w:t>
+        </w:rPr>
+        <w:t xml:space="preserve">Islamabad, Pakistan</w:t>
       </w:r>
       <w:r>
         <w:br w:type="column"/>
@@ -120,9 +106,8 @@
           <w:iCs/>
           <w:sz w:val="18"/>
           <w:szCs w:val="18"/>
-          <w:highlight w:val="yellow"/>
-        </w:rPr>
-        <w:t xml:space="preserve">[Department]</w:t>
+        </w:rPr>
+        <w:t xml:space="preserve">School of Electrical Engineering and Computer Science (SEECS)</w:t>
       </w:r>
       <w:r>
         <w:br/>
@@ -133,9 +118,8 @@
           <w:iCs/>
           <w:sz w:val="18"/>
           <w:szCs w:val="18"/>
-          <w:highlight w:val="yellow"/>
-        </w:rPr>
-        <w:t xml:space="preserve">[University / Organization]</w:t>
+        </w:rPr>
+        <w:t xml:space="preserve">National University of Sciences and Technology (NUST)</w:t>
       </w:r>
       <w:r>
         <w:br/>
@@ -144,20 +128,8 @@
         <w:rPr>
           <w:sz w:val="18"/>
           <w:szCs w:val="18"/>
-          <w:highlight w:val="yellow"/>
-        </w:rPr>
-        <w:t xml:space="preserve">[City, Country]</w:t>
-      </w:r>
-      <w:r>
-        <w:br/>
-      </w:r>
-      <w:r>
-        <w:rPr>
-          <w:sz w:val="18"/>
-          <w:szCs w:val="18"/>
-          <w:highlight w:val="yellow"/>
-        </w:rPr>
-        <w:t xml:space="preserve">[email address]</w:t>
+        </w:rPr>
+        <w:t xml:space="preserve">Islamabad, Pakistan</w:t>
       </w:r>
     </w:p>
     <w:p/>

</xml_diff>

<commit_message>
Paper: add author email addresses
Co-Authored-By: Claude Opus 5.5 <noreply@anthropic.com>
</commit_message>
<xml_diff>
--- a/paper/ICEET2026_Right_but_Unsure.docx
+++ b/paper/ICEET2026_Right_but_Unsure.docx
@@ -88,6 +88,16 @@
         <w:t xml:space="preserve">Islamabad, Pakistan</w:t>
       </w:r>
       <w:r>
+        <w:br/>
+      </w:r>
+      <w:r>
+        <w:rPr>
+          <w:sz w:val="18"/>
+          <w:szCs w:val="18"/>
+        </w:rPr>
+        <w:t xml:space="preserve">mrauf.bese23seecs@seecs.edu.pk</w:t>
+      </w:r>
+      <w:r>
         <w:br w:type="column"/>
       </w:r>
       <w:r>
@@ -130,6 +140,16 @@
           <w:szCs w:val="18"/>
         </w:rPr>
         <w:t xml:space="preserve">Islamabad, Pakistan</w:t>
+      </w:r>
+      <w:r>
+        <w:br/>
+      </w:r>
+      <w:r>
+        <w:rPr>
+          <w:sz w:val="18"/>
+          <w:szCs w:val="18"/>
+        </w:rPr>
+        <w:t xml:space="preserve">muhammad.bese23seecs@seecs.edu.pk</w:t>
       </w:r>
     </w:p>
     <w:p/>

</xml_diff>